<commit_message>
We Love PDF code push
</commit_message>
<xml_diff>
--- a/integration_test_converted.docx
+++ b/integration_test_converted.docx
@@ -16,8 +16,8 @@
         <w:autoSpaceDN w:val="0"/>
         <w:autoSpaceDE w:val="0"/>
         <w:widowControl/>
-        <w:spacing w:line="382" w:lineRule="exact" w:before="0" w:after="0"/>
-        <w:ind w:left="560" w:right="3312" w:firstLine="0"/>
+        <w:spacing w:line="364" w:lineRule="exact" w:before="0" w:after="0"/>
+        <w:ind w:left="560" w:right="3168" w:firstLine="0"/>
         <w:jc w:val="left"/>
       </w:pPr>
       <w:r>
@@ -28,7 +28,7 @@
           <w:color w:val="000000"/>
           <w:sz w:val="24"/>
         </w:rPr>
-        <w:t xml:space="preserve">Integration Test PDF </w:t>
+        <w:t xml:space="preserve">Test PDF for Compression </w:t>
       </w:r>
       <w:r>
         <w:br/>
@@ -41,8 +41,18 @@
           <w:color w:val="000000"/>
           <w:sz w:val="24"/>
         </w:rPr>
-        <w:t xml:space="preserve">This tests the full frontend-backend integration. </w:t>
+        <w:t>This is a test document to verify compression works.</w:t>
       </w:r>
+    </w:p>
+    <w:p>
+      <w:pPr>
+        <w:autoSpaceDN w:val="0"/>
+        <w:autoSpaceDE w:val="0"/>
+        <w:widowControl/>
+        <w:spacing w:line="330" w:lineRule="exact" w:before="70" w:after="0"/>
+        <w:ind w:left="560" w:right="0" w:firstLine="0"/>
+        <w:jc w:val="left"/>
+      </w:pPr>
       <w:r>
         <w:rPr>
           <w:rFonts w:ascii="Helvetica" w:hAnsi="Helvetica" w:eastAsia="Helvetica"/>
@@ -51,17 +61,7 @@
           <w:color w:val="000000"/>
           <w:sz w:val="24"/>
         </w:rPr>
-        <w:t xml:space="preserve">PDF uploaded via frontend, processed by backend. </w:t>
-      </w:r>
-      <w:r>
-        <w:rPr>
-          <w:rFonts w:ascii="Helvetica" w:hAnsi="Helvetica" w:eastAsia="Helvetica"/>
-          <w:b w:val="0"/>
-          <w:i w:val="0"/>
-          <w:color w:val="000000"/>
-          <w:sz w:val="24"/>
-        </w:rPr>
-        <w:t>Word document should contain this text.</w:t>
+        <w:t>Compression levels: low, medium, high</w:t>
       </w:r>
     </w:p>
     <w:sectPr>

</xml_diff>